<commit_message>
doc: update Stundent#2 documentation for July Call
</commit_message>
<xml_diff>
--- a/reports/C2/Student #2/02 - Requirements - Student #2.docx
+++ b/reports/C2/Student #2/02 - Requirements - Student #2.docx
@@ -405,12 +405,14 @@
               <w:pStyle w:val="Sinespaciado"/>
               <w:rPr>
                 <w:rFonts w:asciiTheme="majorHAnsi" w:hAnsiTheme="majorHAnsi" w:cstheme="majorHAnsi"/>
+                <w:lang w:val="pt-PT"/>
               </w:rPr>
             </w:pPr>
             <w:r>
               <w:rPr>
                 <w:rFonts w:asciiTheme="majorHAnsi" w:hAnsiTheme="majorHAnsi" w:cstheme="majorHAnsi"/>
                 <w:b/>
+                <w:lang w:val="pt-PT"/>
               </w:rPr>
               <w:t>Name:</w:t>
             </w:r>
@@ -418,12 +420,14 @@
               <w:rPr>
                 <w:rFonts w:asciiTheme="majorHAnsi" w:hAnsiTheme="majorHAnsi" w:cstheme="majorHAnsi"/>
                 <w:b/>
+                <w:lang w:val="pt-PT"/>
               </w:rPr>
               <w:tab/>
             </w:r>
             <w:r>
               <w:rPr>
                 <w:rFonts w:asciiTheme="majorHAnsi" w:hAnsiTheme="majorHAnsi" w:cstheme="majorHAnsi"/>
+                <w:lang w:val="pt-PT"/>
               </w:rPr>
               <w:tab/>
             </w:r>
@@ -432,6 +436,7 @@
               <w:sdtPr>
                 <w:rPr>
                   <w:rFonts w:asciiTheme="majorHAnsi" w:hAnsiTheme="majorHAnsi" w:cstheme="majorHAnsi"/>
+                  <w:lang w:val="pt-PT"/>
                 </w:rPr>
                 <w:tag w:val="Student2"/>
                 <w:id w:val="2044784553"/>
@@ -445,30 +450,35 @@
                 <w:r>
                   <w:rPr>
                     <w:rFonts w:asciiTheme="majorHAnsi" w:hAnsiTheme="majorHAnsi" w:cstheme="majorHAnsi"/>
+                    <w:lang w:val="pt-PT"/>
                   </w:rPr>
                   <w:t xml:space="preserve"> </w:t>
                 </w:r>
                 <w:r>
                   <w:rPr>
                     <w:rFonts w:asciiTheme="majorHAnsi" w:hAnsiTheme="majorHAnsi" w:cstheme="majorHAnsi"/>
+                    <w:lang w:val="pt-PT"/>
                   </w:rPr>
                   <w:t>Caro Medina</w:t>
                 </w:r>
                 <w:r>
                   <w:rPr>
                     <w:rFonts w:asciiTheme="majorHAnsi" w:hAnsiTheme="majorHAnsi" w:cstheme="majorHAnsi"/>
+                    <w:lang w:val="pt-PT"/>
                   </w:rPr>
                   <w:t xml:space="preserve">, </w:t>
                 </w:r>
                 <w:r>
                   <w:rPr>
                     <w:rFonts w:asciiTheme="majorHAnsi" w:hAnsiTheme="majorHAnsi" w:cstheme="majorHAnsi"/>
+                    <w:lang w:val="pt-PT"/>
                   </w:rPr>
                   <w:t>Rafael David</w:t>
                 </w:r>
                 <w:r>
                   <w:rPr>
                     <w:rFonts w:asciiTheme="majorHAnsi" w:hAnsiTheme="majorHAnsi" w:cstheme="majorHAnsi"/>
+                    <w:lang w:val="pt-PT"/>
                   </w:rPr>
                   <w:t xml:space="preserve">  </w:t>
                 </w:r>
@@ -2283,13 +2293,29 @@
         <w:t xml:space="preserve">. </w:t>
       </w:r>
     </w:p>
+    <w:p>
+      <w:pPr>
+        <w:pStyle w:val="Requirement-Body"/>
+        <w:numPr>
+          <w:ilvl w:val="0"/>
+          <w:numId w:val="0"/>
+        </w:numPr>
+        <w:ind w:left="851" w:hanging="284"/>
+      </w:pPr>
+    </w:p>
     <w:permStart w:id="8470091" w:edGrp="everyone"/>
     <w:p>
       <w:pPr>
         <w:pStyle w:val="Comment-Grader"/>
+        <w:rPr>
+          <w:lang w:val="es-ES"/>
+        </w:rPr>
       </w:pPr>
       <w:sdt>
         <w:sdtPr>
+          <w:rPr>
+            <w:lang w:val="es-ES"/>
+          </w:rPr>
           <w:tag w:val="Verdict"/>
           <w:id w:val="684942382"/>
           <w:placeholder>
@@ -2300,19 +2326,271 @@
         </w:sdtPr>
         <w:sdtContent>
           <w:r>
+            <w:rPr>
+              <w:lang w:val="es-ES"/>
+            </w:rPr>
             <w:t xml:space="preserve"> </w:t>
           </w:r>
           <w:r>
+            <w:rPr>
+              <w:lang w:val="es-ES"/>
+            </w:rPr>
             <w:t>X</w:t>
           </w:r>
           <w:r>
-            <w:t xml:space="preserve">  </w:t>
+            <w:rPr>
+              <w:lang w:val="es-ES"/>
+            </w:rPr>
+            <w:t xml:space="preserve"> </w:t>
           </w:r>
         </w:sdtContent>
       </w:sdt>
       <w:permEnd w:id="8470091"/>
       <w:r>
-        <w:t xml:space="preserve">    </w:t>
+        <w:rPr>
+          <w:lang w:val="es-ES"/>
+        </w:rPr>
+        <w:t xml:space="preserve"> </w:t>
+      </w:r>
+      <w:r>
+        <w:rPr>
+          <w:lang w:val="es-ES"/>
+        </w:rPr>
+        <w:t>Es posible actualizar una reserva para asignarla a otro vuelo</w:t>
+      </w:r>
+      <w:r>
+        <w:rPr>
+          <w:lang w:val="es-ES"/>
+        </w:rPr>
+        <w:t xml:space="preserve"> no disponible. Tras esto, al intentar mostrar la reserva se muestra un error 500.</w:t>
+      </w:r>
+      <w:r>
+        <w:rPr>
+          <w:lang w:val="es-ES"/>
+        </w:rPr>
+        <w:t xml:space="preserve">   </w:t>
+      </w:r>
+    </w:p>
+    <w:p>
+      <w:pPr>
+        <w:pStyle w:val="Comment-Student"/>
+        <w:rPr>
+          <w:lang w:val="es-ES"/>
+        </w:rPr>
+      </w:pPr>
+      <w:r>
+        <w:rPr>
+          <w:lang w:val="es-ES"/>
+        </w:rPr>
+        <w:t>[X]</w:t>
+      </w:r>
+      <w:r>
+        <w:rPr>
+          <w:lang w:val="es-ES"/>
+        </w:rPr>
+        <w:t xml:space="preserve"> Tenía el </w:t>
+      </w:r>
+      <w:r>
+        <w:rPr>
+          <w:lang w:val="es-ES"/>
+        </w:rPr>
+        <w:t>c</w:t>
+      </w:r>
+      <w:r>
+        <w:rPr>
+          <w:lang w:val="es-ES"/>
+        </w:rPr>
+        <w:t>ódigo q</w:t>
+      </w:r>
+      <w:r>
+        <w:rPr>
+          <w:lang w:val="es-ES"/>
+        </w:rPr>
+        <w:t xml:space="preserve">ue evitaba ese hackeo en el proyecto, pero lo eliminé en uno de los últimos commits, porque había un caso que no supe </w:t>
+      </w:r>
+      <w:r>
+        <w:rPr>
+          <w:lang w:val="es-ES"/>
+        </w:rPr>
+        <w:t>distinguir:</w:t>
+      </w:r>
+      <w:r>
+        <w:rPr>
+          <w:lang w:val="es-ES"/>
+        </w:rPr>
+        <w:t xml:space="preserve"> cuando no se seleccionaba ninguna opción del desplegable de Vuelos (se escogía la opción “----“) de cuando se hackeaba y se ponía un Id de Vuelo que no existiese en la BD, y se devolvía Null desde el método del repositorio </w:t>
+      </w:r>
+      <w:r>
+        <w:rPr>
+          <w:lang w:val="es-ES"/>
+        </w:rPr>
+        <w:t>find</w:t>
+      </w:r>
+      <w:r>
+        <w:rPr>
+          <w:lang w:val="es-ES"/>
+        </w:rPr>
+        <w:t>Flight</w:t>
+      </w:r>
+      <w:r>
+        <w:rPr>
+          <w:lang w:val="es-ES"/>
+        </w:rPr>
+        <w:t>ById</w:t>
+      </w:r>
+      <w:r>
+        <w:rPr>
+          <w:lang w:val="es-ES"/>
+        </w:rPr>
+        <w:t>(</w:t>
+      </w:r>
+      <w:r>
+        <w:rPr>
+          <w:lang w:val="es-ES"/>
+        </w:rPr>
+        <w:t>flightId</w:t>
+      </w:r>
+      <w:r>
+        <w:rPr>
+          <w:lang w:val="es-ES"/>
+        </w:rPr>
+        <w:t xml:space="preserve">). Ya </w:t>
+      </w:r>
+      <w:r>
+        <w:rPr>
+          <w:lang w:val="es-ES"/>
+        </w:rPr>
+        <w:t>he conseguido ver la diferencia</w:t>
+      </w:r>
+      <w:r>
+        <w:rPr>
+          <w:lang w:val="es-ES"/>
+        </w:rPr>
+        <w:t xml:space="preserve"> (de hecho la estoy usando en otras partes del proyecto)</w:t>
+      </w:r>
+      <w:r>
+        <w:rPr>
+          <w:lang w:val="es-ES"/>
+        </w:rPr>
+        <w:t xml:space="preserve"> entre no seleccionar ninguna </w:t>
+      </w:r>
+      <w:r>
+        <w:rPr>
+          <w:lang w:val="es-ES"/>
+        </w:rPr>
+        <w:t>opción en</w:t>
+      </w:r>
+      <w:r>
+        <w:rPr>
+          <w:lang w:val="es-ES"/>
+        </w:rPr>
+        <w:t xml:space="preserve"> el desplegable (“-----“), en este caso el id del vuelo es id=0, con lo cual, dejo pasar el flujo del Authorise() a Validate() y se produce el error de validación de que “No puede ser nulo”</w:t>
+      </w:r>
+      <w:r>
+        <w:rPr>
+          <w:lang w:val="es-ES"/>
+        </w:rPr>
+        <w:t xml:space="preserve"> el vuelo, y en cambio, si el id es distinto de 0 sí entra a comprobar que </w:t>
+      </w:r>
+      <w:r>
+        <w:rPr>
+          <w:lang w:val="es-ES"/>
+        </w:rPr>
+        <w:t xml:space="preserve">el </w:t>
+      </w:r>
+      <w:r>
+        <w:rPr>
+          <w:lang w:val="es-ES"/>
+        </w:rPr>
+        <w:t>id seleccionado</w:t>
+      </w:r>
+      <w:r>
+        <w:rPr>
+          <w:lang w:val="es-ES"/>
+        </w:rPr>
+        <w:t>,</w:t>
+      </w:r>
+      <w:r>
+        <w:rPr>
+          <w:lang w:val="es-ES"/>
+        </w:rPr>
+        <w:t xml:space="preserve"> o </w:t>
+      </w:r>
+      <w:r>
+        <w:rPr>
+          <w:lang w:val="es-ES"/>
+        </w:rPr>
+        <w:t>hackeado,</w:t>
+      </w:r>
+      <w:r>
+        <w:rPr>
+          <w:lang w:val="es-ES"/>
+        </w:rPr>
+        <w:t xml:space="preserve"> sea uno de los disponibles, y si no es </w:t>
+      </w:r>
+      <w:r>
+        <w:rPr>
+          <w:lang w:val="es-ES"/>
+        </w:rPr>
+        <w:t>a</w:t>
+      </w:r>
+      <w:r>
+        <w:rPr>
+          <w:lang w:val="es-ES"/>
+        </w:rPr>
+        <w:t xml:space="preserve">sí </w:t>
+      </w:r>
+      <w:r>
+        <w:rPr>
+          <w:lang w:val="es-ES"/>
+        </w:rPr>
+        <w:t xml:space="preserve">ahora </w:t>
+      </w:r>
+      <w:r>
+        <w:rPr>
+          <w:lang w:val="es-ES"/>
+        </w:rPr>
+        <w:t>provoca</w:t>
+      </w:r>
+      <w:r>
+        <w:rPr>
+          <w:lang w:val="es-ES"/>
+        </w:rPr>
+        <w:t xml:space="preserve"> el error 500 de “No autorizado”.</w:t>
+      </w:r>
+    </w:p>
+    <w:p>
+      <w:pPr>
+        <w:pStyle w:val="Comment-Student"/>
+        <w:rPr>
+          <w:lang w:val="es-ES"/>
+        </w:rPr>
+      </w:pPr>
+      <w:r>
+        <w:rPr>
+          <w:lang w:val="es-ES"/>
+        </w:rPr>
+        <w:t>El quiz estaba en distinguir Id=0 (vuelo no seleccionado en desplegable -&gt; Error de Validación, no puede ser nulo) de Id=Null, cuando se hackeaba a un Id que no existe en la BD y se devuelve por tanto un Id de vuelo Null -&gt; Error de “No autorizado 500”</w:t>
+      </w:r>
+      <w:r>
+        <w:rPr>
+          <w:lang w:val="es-ES"/>
+        </w:rPr>
+        <w:t>. Del mismo modo, cuando se hackea y se pone un Id de vuelo que sí existe, pero no está entre los disponibles, también se produce el error 500 “No autorizado”.</w:t>
+      </w:r>
+    </w:p>
+    <w:p>
+      <w:pPr>
+        <w:pStyle w:val="Comment-Student"/>
+        <w:rPr>
+          <w:lang w:val="es-ES"/>
+        </w:rPr>
+      </w:pPr>
+      <w:r>
+        <w:rPr>
+          <w:lang w:val="es-ES"/>
+        </w:rPr>
+        <w:t>Con lo cual, añadiendo ese código a Validate() ha quedado solucionado el hackeo de asignar un vuelo no disponible, indicando ahora 500 “No autorizado” para cualquier Id de vuelo que no esté en el desplegable. Del mismo modo he incluido el código para evitar el hackeo del desplegable de TravelClass, para que sólo admita los valores disponibles “ECONOMY” o “BUSINESS”.</w:t>
       </w:r>
     </w:p>
     <w:p>
@@ -2368,6 +2646,7 @@
         <w:pStyle w:val="Requirement-Body"/>
       </w:pPr>
       <w:r>
+        <w:lastRenderedPageBreak/>
         <w:t xml:space="preserve">Show the details of their </w:t>
       </w:r>
       <w:r>
@@ -3954,9 +4233,15 @@
     <w:p>
       <w:pPr>
         <w:pStyle w:val="Comment-Grader"/>
+        <w:rPr>
+          <w:lang w:val="es-ES"/>
+        </w:rPr>
       </w:pPr>
       <w:sdt>
         <w:sdtPr>
+          <w:rPr>
+            <w:lang w:val="es-ES"/>
+          </w:rPr>
           <w:tag w:val="Verdict"/>
           <w:id w:val="626131066"/>
           <w:placeholder>
@@ -3967,19 +4252,49 @@
         </w:sdtPr>
         <w:sdtContent>
           <w:r>
-            <w:t xml:space="preserve"> </w:t>
-          </w:r>
-          <w:r>
-            <w:t>X</w:t>
-          </w:r>
-          <w:r>
-            <w:t xml:space="preserve">  </w:t>
+            <w:rPr>
+              <w:lang w:val="es-ES"/>
+            </w:rPr>
+            <w:t xml:space="preserve">   </w:t>
           </w:r>
         </w:sdtContent>
       </w:sdt>
       <w:permEnd w:id="1374191219"/>
       <w:r>
-        <w:t xml:space="preserve">    </w:t>
+        <w:rPr>
+          <w:lang w:val="es-ES"/>
+        </w:rPr>
+        <w:t xml:space="preserve"> </w:t>
+      </w:r>
+      <w:r>
+        <w:rPr>
+          <w:lang w:val="es-ES"/>
+        </w:rPr>
+        <w:t xml:space="preserve">Es posible visualizar los pasajeros </w:t>
+      </w:r>
+      <w:r>
+        <w:rPr>
+          <w:lang w:val="es-ES"/>
+        </w:rPr>
+        <w:t xml:space="preserve">y reservas </w:t>
+      </w:r>
+      <w:r>
+        <w:rPr>
+          <w:lang w:val="es-ES"/>
+        </w:rPr>
+        <w:t xml:space="preserve">de aquellas reservas que </w:t>
+      </w:r>
+      <w:r>
+        <w:rPr>
+          <w:lang w:val="es-ES"/>
+        </w:rPr>
+        <w:t>aún están en modo borrador.</w:t>
+      </w:r>
+      <w:r>
+        <w:rPr>
+          <w:lang w:val="es-ES"/>
+        </w:rPr>
+        <w:t xml:space="preserve">   </w:t>
       </w:r>
     </w:p>
     <w:p>
@@ -9699,8 +10014,12 @@
   </w:compat>
   <w:rsids>
     <w:rsidRoot w:val="004D7778"/>
+    <w:rsid w:val="00007AAC"/>
+    <w:rsid w:val="00025A7C"/>
     <w:rsid w:val="00061CE8"/>
     <w:rsid w:val="000656B8"/>
+    <w:rsid w:val="000A08D5"/>
+    <w:rsid w:val="000A60FE"/>
     <w:rsid w:val="000B4661"/>
     <w:rsid w:val="0010552B"/>
     <w:rsid w:val="001221F0"/>
@@ -9714,7 +10033,9 @@
     <w:rsid w:val="00325E44"/>
     <w:rsid w:val="00362541"/>
     <w:rsid w:val="00362E40"/>
+    <w:rsid w:val="003646E4"/>
     <w:rsid w:val="003936CA"/>
+    <w:rsid w:val="003942D6"/>
     <w:rsid w:val="003B716A"/>
     <w:rsid w:val="003C22AA"/>
     <w:rsid w:val="004209F9"/>
@@ -9722,6 +10043,7 @@
     <w:rsid w:val="004A43F4"/>
     <w:rsid w:val="004B23B9"/>
     <w:rsid w:val="004D7778"/>
+    <w:rsid w:val="00503AA0"/>
     <w:rsid w:val="0054309A"/>
     <w:rsid w:val="005650B2"/>
     <w:rsid w:val="00635F6F"/>
@@ -9734,19 +10056,23 @@
     <w:rsid w:val="007C004C"/>
     <w:rsid w:val="007E6C7A"/>
     <w:rsid w:val="008B1087"/>
+    <w:rsid w:val="008C4DF8"/>
     <w:rsid w:val="0090361B"/>
     <w:rsid w:val="009216F4"/>
     <w:rsid w:val="0093034B"/>
     <w:rsid w:val="00944E58"/>
     <w:rsid w:val="00945E99"/>
     <w:rsid w:val="00953D97"/>
+    <w:rsid w:val="00986A13"/>
     <w:rsid w:val="00990B95"/>
     <w:rsid w:val="00A222AC"/>
     <w:rsid w:val="00B941AF"/>
     <w:rsid w:val="00BC7967"/>
+    <w:rsid w:val="00BF53E8"/>
     <w:rsid w:val="00C12AB9"/>
     <w:rsid w:val="00C276D2"/>
     <w:rsid w:val="00C63AB0"/>
+    <w:rsid w:val="00C96811"/>
     <w:rsid w:val="00D21D3B"/>
     <w:rsid w:val="00D72CB9"/>
     <w:rsid w:val="00D933FC"/>
@@ -9757,13 +10083,16 @@
     <w:rsid w:val="00DD70FC"/>
     <w:rsid w:val="00E25325"/>
     <w:rsid w:val="00E76AB3"/>
+    <w:rsid w:val="00E96C03"/>
     <w:rsid w:val="00EA1B9C"/>
     <w:rsid w:val="00ED34A4"/>
     <w:rsid w:val="00ED3D0C"/>
     <w:rsid w:val="00F06ED1"/>
+    <w:rsid w:val="00F13536"/>
     <w:rsid w:val="00F30381"/>
     <w:rsid w:val="00F36204"/>
     <w:rsid w:val="00F47F00"/>
+    <w:rsid w:val="00F51B01"/>
     <w:rsid w:val="00F64E54"/>
     <w:rsid w:val="00F75A93"/>
     <w:rsid w:val="00F83338"/>

</xml_diff>